<commit_message>
paper4: complete the AI declaration with the tool version
The submission portal will not advance without ticking the AI-policy checkbox,
and that checkbox confirms the manuscript names the tool with its version. The
declaration now does, so the box can be ticked truthfully rather than ticked
and corrected afterwards.

The build guard stays in place for the placeholder.

Co-Authored-By: Claude Opus 5 <noreply@anthropic.com>
Claude-Session: https://claude.ai/code/session_012NgwaUXsd86P5pxtpLwPwh
</commit_message>
<xml_diff>
--- a/docs/research/amendment_paper/submission_manuscript_with_author_details.docx
+++ b/docs/research/amendment_paper/submission_manuscript_with_author_details.docx
@@ -4257,13 +4257,13 @@
         <w:t xml:space="preserve"> </w:t>
       </w:r>
       <w:r>
-        <w:t xml:space="preserve">Claude</w:t>
-      </w:r>
-      <w:r>
-        <w:t xml:space="preserve"> </w:t>
-      </w:r>
-      <w:r>
-        <w:t xml:space="preserve">(Anthropic), version ANONVERSION.</w:t>
+        <w:t xml:space="preserve">Claude Opus 5</w:t>
+      </w:r>
+      <w:r>
+        <w:t xml:space="preserve"> </w:t>
+      </w:r>
+      <w:r>
+        <w:t xml:space="preserve">(Anthropic).</w:t>
       </w:r>
       <w:r>
         <w:t xml:space="preserve"> </w:t>

</xml_diff>